<commit_message>
Stabilize session locks, failure videos, and customer money-flow steps.
Keep file locks off OneDrive, persist Playwright recordings into Extent history, and select live random deposit/withdraw amounts and categories instead of shared-memory values that stalled the dropdowns.

Co-authored-by: Cursor <cursoragent@cursor.com>
</commit_message>
<xml_diff>
--- a/docs/hld-stakeholder.docx
+++ b/docs/hld-stakeholder.docx
@@ -556,6 +556,388 @@
         <w:spacing w:after="120" w:before="240"/>
       </w:pPr>
       <w:r>
+        <w:t xml:space="preserve">3.1 HLD diagrams</w:t>
+      </w:r>
+    </w:p>
+    <w:p>
+      <w:pPr>
+        <w:spacing w:after="120"/>
+      </w:pPr>
+      <w:r>
+        <w:rPr>
+          <w:color w:val="0F172A"/>
+          <w:sz w:val="22"/>
+          <w:szCs w:val="22"/>
+        </w:rPr>
+        <w:t xml:space="preserve">Captured from docs/hld.html (Mermaid) so stakeholders see the same architecture views as the HTML design.</w:t>
+      </w:r>
+    </w:p>
+    <w:p>
+      <w:pPr>
+        <w:spacing w:after="120"/>
+      </w:pPr>
+      <w:r>
+        <w:rPr>
+          <w:b/>
+          <w:bCs/>
+          <w:color w:val="0F172A"/>
+          <w:sz w:val="22"/>
+          <w:szCs w:val="22"/>
+        </w:rPr>
+        <w:t xml:space="preserve">System context</w:t>
+      </w:r>
+    </w:p>
+    <w:p>
+      <w:pPr>
+        <w:spacing w:after="200"/>
+      </w:pPr>
+      <w:r>
+        <w:drawing>
+          <wp:inline distT="0" distB="0" distL="0" distR="0">
+            <wp:extent cx="5905500" cy="2826201"/>
+            <wp:effectExtent t="0" r="0" b="0" l="0"/>
+            <wp:docPr id="1" name="System context" descr="System context" title="System context"/>
+            <wp:cNvGraphicFramePr>
+              <a:graphicFrameLocks xmlns:a="http://schemas.openxmlformats.org/drawingml/2006/main" noChangeAspect="1"/>
+            </wp:cNvGraphicFramePr>
+            <a:graphic xmlns:a="http://schemas.openxmlformats.org/drawingml/2006/main">
+              <a:graphicData uri="http://schemas.openxmlformats.org/drawingml/2006/picture">
+                <pic:pic xmlns:pic="http://schemas.openxmlformats.org/drawingml/2006/picture">
+                  <pic:nvPicPr>
+                    <pic:cNvPr id="0" name="" descr=""/>
+                    <pic:cNvPicPr>
+                      <a:picLocks noChangeAspect="1" noChangeArrowheads="1"/>
+                    </pic:cNvPicPr>
+                  </pic:nvPicPr>
+                  <pic:blipFill>
+                    <a:blip r:embed="rId8" cstate="none"/>
+                    <a:srcRect/>
+                    <a:stretch>
+                      <a:fillRect/>
+                    </a:stretch>
+                  </pic:blipFill>
+                  <pic:spPr bwMode="auto">
+                    <a:xfrm>
+                      <a:off x="0" y="0"/>
+                      <a:ext cx="5905500" cy="2826201"/>
+                    </a:xfrm>
+                    <a:prstGeom prst="rect">
+                      <a:avLst/>
+                    </a:prstGeom>
+                  </pic:spPr>
+                </pic:pic>
+              </a:graphicData>
+            </a:graphic>
+          </wp:inline>
+        </w:drawing>
+      </w:r>
+    </w:p>
+    <w:p>
+      <w:pPr>
+        <w:spacing w:after="120"/>
+      </w:pPr>
+      <w:r>
+        <w:rPr>
+          <w:b/>
+          <w:bCs/>
+          <w:color w:val="0F172A"/>
+          <w:sz w:val="22"/>
+          <w:szCs w:val="22"/>
+        </w:rPr>
+        <w:t xml:space="preserve">Automation testing tools</w:t>
+      </w:r>
+    </w:p>
+    <w:p>
+      <w:pPr>
+        <w:spacing w:after="200"/>
+      </w:pPr>
+      <w:r>
+        <w:drawing>
+          <wp:inline distT="0" distB="0" distL="0" distR="0">
+            <wp:extent cx="2228088" cy="3619500"/>
+            <wp:effectExtent t="0" r="0" b="0" l="0"/>
+            <wp:docPr id="1" name="Automation testing tools" descr="Automation testing tools" title="Automation testing tools"/>
+            <wp:cNvGraphicFramePr>
+              <a:graphicFrameLocks xmlns:a="http://schemas.openxmlformats.org/drawingml/2006/main" noChangeAspect="1"/>
+            </wp:cNvGraphicFramePr>
+            <a:graphic xmlns:a="http://schemas.openxmlformats.org/drawingml/2006/main">
+              <a:graphicData uri="http://schemas.openxmlformats.org/drawingml/2006/picture">
+                <pic:pic xmlns:pic="http://schemas.openxmlformats.org/drawingml/2006/picture">
+                  <pic:nvPicPr>
+                    <pic:cNvPr id="0" name="" descr=""/>
+                    <pic:cNvPicPr>
+                      <a:picLocks noChangeAspect="1" noChangeArrowheads="1"/>
+                    </pic:cNvPicPr>
+                  </pic:nvPicPr>
+                  <pic:blipFill>
+                    <a:blip r:embed="rId9" cstate="none"/>
+                    <a:srcRect/>
+                    <a:stretch>
+                      <a:fillRect/>
+                    </a:stretch>
+                  </pic:blipFill>
+                  <pic:spPr bwMode="auto">
+                    <a:xfrm>
+                      <a:off x="0" y="0"/>
+                      <a:ext cx="2228088" cy="3619500"/>
+                    </a:xfrm>
+                    <a:prstGeom prst="rect">
+                      <a:avLst/>
+                    </a:prstGeom>
+                  </pic:spPr>
+                </pic:pic>
+              </a:graphicData>
+            </a:graphic>
+          </wp:inline>
+        </w:drawing>
+      </w:r>
+    </w:p>
+    <w:p>
+      <w:pPr>
+        <w:spacing w:after="120"/>
+      </w:pPr>
+      <w:r>
+        <w:rPr>
+          <w:b/>
+          <w:bCs/>
+          <w:color w:val="0F172A"/>
+          <w:sz w:val="22"/>
+          <w:szCs w:val="22"/>
+        </w:rPr>
+        <w:t xml:space="preserve">Call chain</w:t>
+      </w:r>
+    </w:p>
+    <w:p>
+      <w:pPr>
+        <w:spacing w:after="200"/>
+      </w:pPr>
+      <w:r>
+        <w:drawing>
+          <wp:inline distT="0" distB="0" distL="0" distR="0">
+            <wp:extent cx="5905500" cy="1114816"/>
+            <wp:effectExtent t="0" r="0" b="0" l="0"/>
+            <wp:docPr id="1" name="Call chain" descr="Call chain" title="Call chain"/>
+            <wp:cNvGraphicFramePr>
+              <a:graphicFrameLocks xmlns:a="http://schemas.openxmlformats.org/drawingml/2006/main" noChangeAspect="1"/>
+            </wp:cNvGraphicFramePr>
+            <a:graphic xmlns:a="http://schemas.openxmlformats.org/drawingml/2006/main">
+              <a:graphicData uri="http://schemas.openxmlformats.org/drawingml/2006/picture">
+                <pic:pic xmlns:pic="http://schemas.openxmlformats.org/drawingml/2006/picture">
+                  <pic:nvPicPr>
+                    <pic:cNvPr id="0" name="" descr=""/>
+                    <pic:cNvPicPr>
+                      <a:picLocks noChangeAspect="1" noChangeArrowheads="1"/>
+                    </pic:cNvPicPr>
+                  </pic:nvPicPr>
+                  <pic:blipFill>
+                    <a:blip r:embed="rId10" cstate="none"/>
+                    <a:srcRect/>
+                    <a:stretch>
+                      <a:fillRect/>
+                    </a:stretch>
+                  </pic:blipFill>
+                  <pic:spPr bwMode="auto">
+                    <a:xfrm>
+                      <a:off x="0" y="0"/>
+                      <a:ext cx="5905500" cy="1114816"/>
+                    </a:xfrm>
+                    <a:prstGeom prst="rect">
+                      <a:avLst/>
+                    </a:prstGeom>
+                  </pic:spPr>
+                </pic:pic>
+              </a:graphicData>
+            </a:graphic>
+          </wp:inline>
+        </w:drawing>
+      </w:r>
+    </w:p>
+    <w:p>
+      <w:pPr>
+        <w:spacing w:after="120"/>
+      </w:pPr>
+      <w:r>
+        <w:rPr>
+          <w:b/>
+          <w:bCs/>
+          <w:color w:val="0F172A"/>
+          <w:sz w:val="22"/>
+          <w:szCs w:val="22"/>
+        </w:rPr>
+        <w:t xml:space="preserve">Execution flow</w:t>
+      </w:r>
+    </w:p>
+    <w:p>
+      <w:pPr>
+        <w:spacing w:after="200"/>
+      </w:pPr>
+      <w:r>
+        <w:drawing>
+          <wp:inline distT="0" distB="0" distL="0" distR="0">
+            <wp:extent cx="5905500" cy="3308290"/>
+            <wp:effectExtent t="0" r="0" b="0" l="0"/>
+            <wp:docPr id="1" name="Execution flow" descr="Execution flow" title="Execution flow"/>
+            <wp:cNvGraphicFramePr>
+              <a:graphicFrameLocks xmlns:a="http://schemas.openxmlformats.org/drawingml/2006/main" noChangeAspect="1"/>
+            </wp:cNvGraphicFramePr>
+            <a:graphic xmlns:a="http://schemas.openxmlformats.org/drawingml/2006/main">
+              <a:graphicData uri="http://schemas.openxmlformats.org/drawingml/2006/picture">
+                <pic:pic xmlns:pic="http://schemas.openxmlformats.org/drawingml/2006/picture">
+                  <pic:nvPicPr>
+                    <pic:cNvPr id="0" name="" descr=""/>
+                    <pic:cNvPicPr>
+                      <a:picLocks noChangeAspect="1" noChangeArrowheads="1"/>
+                    </pic:cNvPicPr>
+                  </pic:nvPicPr>
+                  <pic:blipFill>
+                    <a:blip r:embed="rId11" cstate="none"/>
+                    <a:srcRect/>
+                    <a:stretch>
+                      <a:fillRect/>
+                    </a:stretch>
+                  </pic:blipFill>
+                  <pic:spPr bwMode="auto">
+                    <a:xfrm>
+                      <a:off x="0" y="0"/>
+                      <a:ext cx="5905500" cy="3308290"/>
+                    </a:xfrm>
+                    <a:prstGeom prst="rect">
+                      <a:avLst/>
+                    </a:prstGeom>
+                  </pic:spPr>
+                </pic:pic>
+              </a:graphicData>
+            </a:graphic>
+          </wp:inline>
+        </w:drawing>
+      </w:r>
+    </w:p>
+    <w:p>
+      <w:pPr>
+        <w:spacing w:after="120"/>
+      </w:pPr>
+      <w:r>
+        <w:rPr>
+          <w:b/>
+          <w:bCs/>
+          <w:color w:val="0F172A"/>
+          <w:sz w:val="22"/>
+          <w:szCs w:val="22"/>
+        </w:rPr>
+        <w:t xml:space="preserve">Artifact capture</w:t>
+      </w:r>
+    </w:p>
+    <w:p>
+      <w:pPr>
+        <w:spacing w:after="200"/>
+      </w:pPr>
+      <w:r>
+        <w:drawing>
+          <wp:inline distT="0" distB="0" distL="0" distR="0">
+            <wp:extent cx="5905500" cy="2488749"/>
+            <wp:effectExtent t="0" r="0" b="0" l="0"/>
+            <wp:docPr id="1" name="Artifact capture" descr="Artifact capture" title="Artifact capture"/>
+            <wp:cNvGraphicFramePr>
+              <a:graphicFrameLocks xmlns:a="http://schemas.openxmlformats.org/drawingml/2006/main" noChangeAspect="1"/>
+            </wp:cNvGraphicFramePr>
+            <a:graphic xmlns:a="http://schemas.openxmlformats.org/drawingml/2006/main">
+              <a:graphicData uri="http://schemas.openxmlformats.org/drawingml/2006/picture">
+                <pic:pic xmlns:pic="http://schemas.openxmlformats.org/drawingml/2006/picture">
+                  <pic:nvPicPr>
+                    <pic:cNvPr id="0" name="" descr=""/>
+                    <pic:cNvPicPr>
+                      <a:picLocks noChangeAspect="1" noChangeArrowheads="1"/>
+                    </pic:cNvPicPr>
+                  </pic:nvPicPr>
+                  <pic:blipFill>
+                    <a:blip r:embed="rId12" cstate="none"/>
+                    <a:srcRect/>
+                    <a:stretch>
+                      <a:fillRect/>
+                    </a:stretch>
+                  </pic:blipFill>
+                  <pic:spPr bwMode="auto">
+                    <a:xfrm>
+                      <a:off x="0" y="0"/>
+                      <a:ext cx="5905500" cy="2488749"/>
+                    </a:xfrm>
+                    <a:prstGeom prst="rect">
+                      <a:avLst/>
+                    </a:prstGeom>
+                  </pic:spPr>
+                </pic:pic>
+              </a:graphicData>
+            </a:graphic>
+          </wp:inline>
+        </w:drawing>
+      </w:r>
+    </w:p>
+    <w:p>
+      <w:pPr>
+        <w:spacing w:after="120"/>
+      </w:pPr>
+      <w:r>
+        <w:rPr>
+          <w:b/>
+          <w:bCs/>
+          <w:color w:val="0F172A"/>
+          <w:sz w:val="22"/>
+          <w:szCs w:val="22"/>
+        </w:rPr>
+        <w:t xml:space="preserve">LLM triage and model routing</w:t>
+      </w:r>
+    </w:p>
+    <w:p>
+      <w:pPr>
+        <w:spacing w:after="200"/>
+      </w:pPr>
+      <w:r>
+        <w:drawing>
+          <wp:inline distT="0" distB="0" distL="0" distR="0">
+            <wp:extent cx="3702625" cy="3619500"/>
+            <wp:effectExtent t="0" r="0" b="0" l="0"/>
+            <wp:docPr id="1" name="LLM triage and model routing" descr="LLM triage and model routing" title="LLM triage and model routing"/>
+            <wp:cNvGraphicFramePr>
+              <a:graphicFrameLocks xmlns:a="http://schemas.openxmlformats.org/drawingml/2006/main" noChangeAspect="1"/>
+            </wp:cNvGraphicFramePr>
+            <a:graphic xmlns:a="http://schemas.openxmlformats.org/drawingml/2006/main">
+              <a:graphicData uri="http://schemas.openxmlformats.org/drawingml/2006/picture">
+                <pic:pic xmlns:pic="http://schemas.openxmlformats.org/drawingml/2006/picture">
+                  <pic:nvPicPr>
+                    <pic:cNvPr id="0" name="" descr=""/>
+                    <pic:cNvPicPr>
+                      <a:picLocks noChangeAspect="1" noChangeArrowheads="1"/>
+                    </pic:cNvPicPr>
+                  </pic:nvPicPr>
+                  <pic:blipFill>
+                    <a:blip r:embed="rId13" cstate="none"/>
+                    <a:srcRect/>
+                    <a:stretch>
+                      <a:fillRect/>
+                    </a:stretch>
+                  </pic:blipFill>
+                  <pic:spPr bwMode="auto">
+                    <a:xfrm>
+                      <a:off x="0" y="0"/>
+                      <a:ext cx="3702625" cy="3619500"/>
+                    </a:xfrm>
+                    <a:prstGeom prst="rect">
+                      <a:avLst/>
+                    </a:prstGeom>
+                  </pic:spPr>
+                </pic:pic>
+              </a:graphicData>
+            </a:graphic>
+          </wp:inline>
+        </w:drawing>
+      </w:r>
+    </w:p>
+    <w:p>
+      <w:pPr>
+        <w:pStyle w:val="Heading1"/>
+        <w:spacing w:after="120" w:before="240"/>
+      </w:pPr>
+      <w:r>
         <w:t xml:space="preserve">4. Current automation scope</w:t>
       </w:r>
     </w:p>
@@ -1373,6 +1755,19 @@
       </w:pPr>
       <w:r>
         <w:t xml:space="preserve">Interactive HTML: docs/hld.html</w:t>
+      </w:r>
+    </w:p>
+    <w:p>
+      <w:pPr>
+        <w:pStyle w:val="ListParagraph"/>
+        <w:numPr>
+          <w:ilvl w:val="0"/>
+          <w:numId w:val="1"/>
+        </w:numPr>
+        <w:spacing w:after="80"/>
+      </w:pPr>
+      <w:r>
+        <w:t xml:space="preserve">Diagram PNGs: docs/diagrams/ (embedded in this briefing)</w:t>
       </w:r>
     </w:p>
     <w:p>

</xml_diff>